<commit_message>
onepager final after review
</commit_message>
<xml_diff>
--- a/2_Product Proposal/OnePager.docx
+++ b/2_Product Proposal/OnePager.docx
@@ -34,7 +34,7 @@
                 <w:noProof/>
               </w:rPr>
               <w:drawing>
-                <wp:inline distT="0" distB="0" distL="0" distR="0" wp14:anchorId="2A562385" wp14:editId="6EC587D6">
+                <wp:inline distT="0" distB="0" distL="0" distR="0" wp14:anchorId="2A562385" wp14:editId="37AF0AD9">
                   <wp:extent cx="892800" cy="864000"/>
                   <wp:effectExtent l="0" t="0" r="3175" b="0"/>
                   <wp:docPr id="277203553" name="Grafik 1"/>
@@ -410,8 +410,6 @@
       </w:r>
       <w:r>
         <w:rPr>
-          <w:b/>
-          <w:bCs/>
           <w:sz w:val="24"/>
           <w:szCs w:val="28"/>
         </w:rPr>
@@ -419,19 +417,10 @@
       </w:r>
       <w:r>
         <w:rPr>
-          <w:b/>
-          <w:bCs/>
-          <w:sz w:val="24"/>
-          <w:szCs w:val="28"/>
-        </w:rPr>
-        <w:t xml:space="preserve"> </w:t>
-      </w:r>
-      <w:r>
-        <w:rPr>
-          <w:sz w:val="24"/>
-          <w:szCs w:val="28"/>
-        </w:rPr>
-        <w:t xml:space="preserve">using microwave </w:t>
+          <w:sz w:val="24"/>
+          <w:szCs w:val="28"/>
+        </w:rPr>
+        <w:t xml:space="preserve"> using microwave </w:t>
       </w:r>
       <w:r>
         <w:rPr>
@@ -497,8 +486,20 @@
       </w:r>
       <w:r>
         <w:rPr>
-          <w:b/>
-          <w:bCs/>
+          <w:sz w:val="24"/>
+          <w:szCs w:val="28"/>
+        </w:rPr>
+        <w:t xml:space="preserve">. </w:t>
+      </w:r>
+      <w:r>
+        <w:rPr>
+          <w:sz w:val="24"/>
+          <w:szCs w:val="28"/>
+        </w:rPr>
+        <w:t>The system is based on the K-LC5 Doppler radar module</w:t>
+      </w:r>
+      <w:r>
+        <w:rPr>
           <w:sz w:val="24"/>
           <w:szCs w:val="28"/>
         </w:rPr>
@@ -509,7 +510,21 @@
           <w:sz w:val="24"/>
           <w:szCs w:val="28"/>
         </w:rPr>
-        <w:t>(see Appendix A).</w:t>
+        <w:t>and an STM32F4 microcontroller</w:t>
+      </w:r>
+      <w:r>
+        <w:rPr>
+          <w:sz w:val="24"/>
+          <w:szCs w:val="28"/>
+        </w:rPr>
+        <w:t>.</w:t>
+      </w:r>
+      <w:r>
+        <w:rPr>
+          <w:sz w:val="24"/>
+          <w:szCs w:val="28"/>
+        </w:rPr>
+        <w:t xml:space="preserve"> The radar</w:t>
       </w:r>
       <w:r>
         <w:rPr>
@@ -517,66 +532,6 @@
           <w:szCs w:val="28"/>
         </w:rPr>
         <w:t xml:space="preserve"> </w:t>
-      </w:r>
-      <w:r>
-        <w:rPr>
-          <w:sz w:val="24"/>
-          <w:szCs w:val="28"/>
-        </w:rPr>
-        <w:t xml:space="preserve">The system is </w:t>
-      </w:r>
-      <w:r>
-        <w:rPr>
-          <w:sz w:val="24"/>
-          <w:szCs w:val="28"/>
-        </w:rPr>
-        <w:t xml:space="preserve">based on the </w:t>
-      </w:r>
-      <w:r>
-        <w:rPr>
-          <w:b/>
-          <w:bCs/>
-          <w:sz w:val="24"/>
-          <w:szCs w:val="28"/>
-        </w:rPr>
-        <w:t>K-LC5 Doppler radar module</w:t>
-      </w:r>
-      <w:r>
-        <w:rPr>
-          <w:sz w:val="24"/>
-          <w:szCs w:val="28"/>
-        </w:rPr>
-        <w:t xml:space="preserve"> </w:t>
-      </w:r>
-      <w:r>
-        <w:rPr>
-          <w:sz w:val="24"/>
-          <w:szCs w:val="28"/>
-        </w:rPr>
-        <w:t xml:space="preserve">and an </w:t>
-      </w:r>
-      <w:r>
-        <w:rPr>
-          <w:b/>
-          <w:bCs/>
-          <w:sz w:val="24"/>
-          <w:szCs w:val="28"/>
-        </w:rPr>
-        <w:t>STM32F4 microcontroller</w:t>
-      </w:r>
-      <w:r>
-        <w:rPr>
-          <w:sz w:val="24"/>
-          <w:szCs w:val="28"/>
-        </w:rPr>
-        <w:t>.</w:t>
-      </w:r>
-      <w:r>
-        <w:rPr>
-          <w:sz w:val="24"/>
-          <w:szCs w:val="28"/>
-        </w:rPr>
-        <w:t xml:space="preserve"> The radar </w:t>
       </w:r>
       <w:r>
         <w:rPr>
@@ -659,19 +614,10 @@
       </w:pPr>
       <w:r>
         <w:rPr>
-          <w:b/>
-          <w:bCs/>
-          <w:sz w:val="24"/>
-          <w:szCs w:val="28"/>
-        </w:rPr>
-        <w:t>Contactless operation</w:t>
-      </w:r>
-      <w:r>
-        <w:rPr>
-          <w:sz w:val="24"/>
-          <w:szCs w:val="28"/>
-        </w:rPr>
-        <w:t>: No physical sensors attached to the body</w:t>
+          <w:sz w:val="24"/>
+          <w:szCs w:val="28"/>
+        </w:rPr>
+        <w:t>Contactless operation: No physical sensors attached to the body</w:t>
       </w:r>
     </w:p>
     <w:p>
@@ -689,19 +635,10 @@
       </w:pPr>
       <w:r>
         <w:rPr>
-          <w:b/>
-          <w:bCs/>
-          <w:sz w:val="24"/>
-          <w:szCs w:val="28"/>
-        </w:rPr>
-        <w:t>High sensitivity</w:t>
-      </w:r>
-      <w:r>
-        <w:rPr>
-          <w:sz w:val="24"/>
-          <w:szCs w:val="28"/>
-        </w:rPr>
-        <w:t>: Detection of sub-millimeter chest movements</w:t>
+          <w:sz w:val="24"/>
+          <w:szCs w:val="28"/>
+        </w:rPr>
+        <w:t>High sensitivity: Detection of sub-millimeter chest movements</w:t>
       </w:r>
     </w:p>
     <w:p>
@@ -719,19 +656,10 @@
       </w:pPr>
       <w:r>
         <w:rPr>
-          <w:b/>
-          <w:bCs/>
-          <w:sz w:val="24"/>
-          <w:szCs w:val="28"/>
-        </w:rPr>
-        <w:t>Measurement range</w:t>
-      </w:r>
-      <w:r>
-        <w:rPr>
-          <w:sz w:val="24"/>
-          <w:szCs w:val="28"/>
-        </w:rPr>
-        <w:t>: Effective operation at short distances (typically up to 1 m)</w:t>
+          <w:sz w:val="24"/>
+          <w:szCs w:val="28"/>
+        </w:rPr>
+        <w:t>Measurement range: Effective operation at short distances (typically up to 1 m)</w:t>
       </w:r>
     </w:p>
     <w:p>
@@ -749,19 +677,10 @@
       </w:pPr>
       <w:r>
         <w:rPr>
-          <w:b/>
-          <w:bCs/>
-          <w:sz w:val="24"/>
-          <w:szCs w:val="28"/>
-        </w:rPr>
-        <w:t>Real-time processing</w:t>
-      </w:r>
-      <w:r>
-        <w:rPr>
-          <w:sz w:val="24"/>
-          <w:szCs w:val="28"/>
-        </w:rPr>
-        <w:t xml:space="preserve">: On-board signal processing using </w:t>
+          <w:sz w:val="24"/>
+          <w:szCs w:val="28"/>
+        </w:rPr>
+        <w:t xml:space="preserve">Real-time processing: On-board signal processing using </w:t>
       </w:r>
       <w:r>
         <w:rPr>
@@ -782,14 +701,7 @@
           <w:sz w:val="24"/>
           <w:szCs w:val="28"/>
         </w:rPr>
-        <w:t xml:space="preserve"> </w:t>
-      </w:r>
-      <w:r>
-        <w:rPr>
-          <w:sz w:val="24"/>
-          <w:szCs w:val="28"/>
-        </w:rPr>
-        <w:t>platform</w:t>
+        <w:t xml:space="preserve"> platform</w:t>
       </w:r>
     </w:p>
     <w:p>
@@ -807,19 +719,10 @@
       </w:pPr>
       <w:r>
         <w:rPr>
-          <w:b/>
-          <w:bCs/>
-          <w:sz w:val="24"/>
-          <w:szCs w:val="28"/>
-        </w:rPr>
-        <w:t>Compact embedded system</w:t>
-      </w:r>
-      <w:r>
-        <w:rPr>
-          <w:sz w:val="24"/>
-          <w:szCs w:val="28"/>
-        </w:rPr>
-        <w:t>: Suitable for integration into various environments</w:t>
+          <w:sz w:val="24"/>
+          <w:szCs w:val="28"/>
+        </w:rPr>
+        <w:t>Compact embedded system: Suitable for integration into various environments</w:t>
       </w:r>
     </w:p>
     <w:p>
@@ -856,16 +759,14 @@
           <w:sz w:val="24"/>
           <w:szCs w:val="28"/>
         </w:rPr>
-        <w:t xml:space="preserve"> sufficient precision for </w:t>
-      </w:r>
-      <w:r>
-        <w:rPr>
-          <w:b/>
-          <w:bCs/>
-          <w:sz w:val="24"/>
-          <w:szCs w:val="28"/>
-        </w:rPr>
-        <w:t>continuous monitoring and trend analysis</w:t>
+        <w:t xml:space="preserve"> sufficient precision </w:t>
+      </w:r>
+      <w:r>
+        <w:rPr>
+          <w:sz w:val="24"/>
+          <w:szCs w:val="28"/>
+        </w:rPr>
+        <w:t>for continuous monitoring and trend analysis</w:t>
       </w:r>
       <w:r>
         <w:rPr>
@@ -927,285 +828,23 @@
     </w:p>
     <w:p>
       <w:pPr>
-        <w:spacing w:before="0"/>
-        <w:rPr>
-          <w:sz w:val="24"/>
-          <w:szCs w:val="28"/>
-        </w:rPr>
-      </w:pPr>
-      <w:r>
-        <w:rPr>
-          <w:sz w:val="24"/>
-          <w:szCs w:val="28"/>
-        </w:rPr>
-        <w:t>The implementation of the system requires:</w:t>
+        <w:rPr>
+          <w:sz w:val="24"/>
+          <w:szCs w:val="28"/>
+        </w:rPr>
+      </w:pPr>
+      <w:r>
+        <w:rPr>
+          <w:sz w:val="24"/>
+          <w:szCs w:val="28"/>
+        </w:rPr>
+        <w:t>The implementation of the system involves the design of an analog front-end for radar signal conditioning and the integration of the K-LC5 radar module with the STM32F4 Discovery board. Radar signals will be acquired using the STM32 ADCs and processed by dedicated firmware implementing respiration suppression, and heart rate extraction algorithms. Measurement data will be visualized via a suitable user interface. Finally, the system performance will be experimentally validated through comparison with a reference ECG heart rate sensor.</w:t>
       </w:r>
     </w:p>
     <w:p>
       <w:pPr>
-        <w:pStyle w:val="ListParagraph"/>
-        <w:numPr>
-          <w:ilvl w:val="0"/>
-          <w:numId w:val="28"/>
-        </w:numPr>
-        <w:spacing w:before="0"/>
-        <w:rPr>
-          <w:sz w:val="24"/>
-          <w:szCs w:val="28"/>
-        </w:rPr>
-      </w:pPr>
-      <w:r>
-        <w:rPr>
-          <w:sz w:val="24"/>
-          <w:szCs w:val="28"/>
-        </w:rPr>
-        <w:t xml:space="preserve">Design of an </w:t>
-      </w:r>
-      <w:r>
-        <w:rPr>
-          <w:b/>
-          <w:bCs/>
-          <w:sz w:val="24"/>
-          <w:szCs w:val="28"/>
-        </w:rPr>
-        <w:t>analog front-end</w:t>
-      </w:r>
-      <w:r>
-        <w:rPr>
-          <w:sz w:val="24"/>
-          <w:szCs w:val="28"/>
-        </w:rPr>
-        <w:t xml:space="preserve"> for radar signal conditioning</w:t>
-      </w:r>
-    </w:p>
-    <w:p>
-      <w:pPr>
-        <w:pStyle w:val="ListParagraph"/>
-        <w:numPr>
-          <w:ilvl w:val="0"/>
-          <w:numId w:val="28"/>
-        </w:numPr>
-        <w:spacing w:before="0"/>
-        <w:rPr>
-          <w:sz w:val="24"/>
-          <w:szCs w:val="28"/>
-        </w:rPr>
-      </w:pPr>
-      <w:r>
-        <w:rPr>
-          <w:b/>
-          <w:bCs/>
-          <w:sz w:val="24"/>
-          <w:szCs w:val="28"/>
-        </w:rPr>
-        <w:t>Integration of the K-LC5 radar module</w:t>
-      </w:r>
-      <w:r>
-        <w:rPr>
-          <w:sz w:val="24"/>
-          <w:szCs w:val="28"/>
-        </w:rPr>
-        <w:t xml:space="preserve"> with the STM32F4 Discovery board</w:t>
-      </w:r>
-    </w:p>
-    <w:p>
-      <w:pPr>
-        <w:pStyle w:val="ListParagraph"/>
-        <w:numPr>
-          <w:ilvl w:val="0"/>
-          <w:numId w:val="28"/>
-        </w:numPr>
-        <w:spacing w:before="0"/>
-        <w:rPr>
-          <w:sz w:val="24"/>
-          <w:szCs w:val="28"/>
-        </w:rPr>
-      </w:pPr>
-      <w:r>
-        <w:rPr>
-          <w:sz w:val="24"/>
-          <w:szCs w:val="28"/>
-        </w:rPr>
-        <w:t>Signal acquisition using the STM32 ADC</w:t>
-      </w:r>
-    </w:p>
-    <w:p>
-      <w:pPr>
-        <w:pStyle w:val="ListParagraph"/>
-        <w:numPr>
-          <w:ilvl w:val="0"/>
-          <w:numId w:val="28"/>
-        </w:numPr>
-        <w:spacing w:before="0"/>
-        <w:rPr>
-          <w:sz w:val="24"/>
-          <w:szCs w:val="28"/>
-        </w:rPr>
-      </w:pPr>
-      <w:r>
-        <w:rPr>
-          <w:b/>
-          <w:bCs/>
-          <w:sz w:val="24"/>
-          <w:szCs w:val="28"/>
-        </w:rPr>
-        <w:t>Firmware development</w:t>
-      </w:r>
-      <w:r>
-        <w:rPr>
-          <w:sz w:val="24"/>
-          <w:szCs w:val="28"/>
-        </w:rPr>
-        <w:t xml:space="preserve"> for filtering, respiration suppression, and heart rate extraction</w:t>
-      </w:r>
-    </w:p>
-    <w:p>
-      <w:pPr>
-        <w:pStyle w:val="ListParagraph"/>
-        <w:numPr>
-          <w:ilvl w:val="0"/>
-          <w:numId w:val="28"/>
-        </w:numPr>
-        <w:spacing w:before="0"/>
-        <w:rPr>
-          <w:sz w:val="24"/>
-          <w:szCs w:val="28"/>
-        </w:rPr>
-      </w:pPr>
-      <w:r>
-        <w:rPr>
-          <w:b/>
-          <w:bCs/>
-          <w:sz w:val="24"/>
-          <w:szCs w:val="28"/>
-        </w:rPr>
-        <w:t>Visualization of measurement data</w:t>
-      </w:r>
-      <w:r>
-        <w:rPr>
-          <w:sz w:val="24"/>
-          <w:szCs w:val="28"/>
-        </w:rPr>
-        <w:t xml:space="preserve"> via a suitable interface</w:t>
-      </w:r>
-    </w:p>
-    <w:p>
-      <w:pPr>
-        <w:pStyle w:val="ListParagraph"/>
-        <w:numPr>
-          <w:ilvl w:val="0"/>
-          <w:numId w:val="28"/>
-        </w:numPr>
-        <w:spacing w:before="0"/>
-        <w:rPr>
-          <w:sz w:val="24"/>
-          <w:szCs w:val="28"/>
-        </w:rPr>
-      </w:pPr>
-      <w:r>
-        <w:rPr>
-          <w:sz w:val="24"/>
-          <w:szCs w:val="28"/>
-        </w:rPr>
-        <w:t xml:space="preserve">Experimental </w:t>
-      </w:r>
-      <w:r>
-        <w:rPr>
-          <w:b/>
-          <w:bCs/>
-          <w:sz w:val="24"/>
-          <w:szCs w:val="28"/>
-        </w:rPr>
-        <w:t>validation</w:t>
-      </w:r>
-      <w:r>
-        <w:rPr>
-          <w:sz w:val="24"/>
-          <w:szCs w:val="28"/>
-        </w:rPr>
-        <w:t xml:space="preserve"> through comparison with a reference </w:t>
-      </w:r>
-      <w:r>
-        <w:rPr>
-          <w:sz w:val="24"/>
-          <w:szCs w:val="28"/>
-        </w:rPr>
-        <w:t xml:space="preserve">ECG </w:t>
-      </w:r>
-      <w:r>
-        <w:rPr>
-          <w:sz w:val="24"/>
-          <w:szCs w:val="28"/>
-        </w:rPr>
-        <w:t>heart rate sensor</w:t>
-      </w:r>
-    </w:p>
-    <w:p>
-      <w:pPr>
-        <w:pStyle w:val="ListParagraph"/>
-        <w:numPr>
-          <w:ilvl w:val="0"/>
-          <w:numId w:val="28"/>
-        </w:numPr>
-        <w:spacing w:before="0"/>
-        <w:rPr>
-          <w:sz w:val="24"/>
-          <w:szCs w:val="28"/>
-        </w:rPr>
-      </w:pPr>
-      <w:r>
-        <w:rPr>
-          <w:sz w:val="24"/>
-          <w:szCs w:val="28"/>
-        </w:rPr>
-        <w:t>A</w:t>
-      </w:r>
-      <w:r>
-        <w:rPr>
-          <w:sz w:val="24"/>
-          <w:szCs w:val="28"/>
-        </w:rPr>
-        <w:t xml:space="preserve"> </w:t>
-      </w:r>
-      <w:r>
-        <w:rPr>
-          <w:b/>
-          <w:bCs/>
-          <w:sz w:val="24"/>
-          <w:szCs w:val="28"/>
-        </w:rPr>
-        <w:t>dielectric lens</w:t>
-      </w:r>
-      <w:r>
-        <w:rPr>
-          <w:sz w:val="24"/>
-          <w:szCs w:val="28"/>
-        </w:rPr>
-        <w:t xml:space="preserve"> may be used to focus the radar beam and improve signal quality</w:t>
-      </w:r>
-    </w:p>
-    <w:p>
-      <w:pPr>
-        <w:spacing w:before="0"/>
-        <w:rPr>
-          <w:sz w:val="24"/>
-          <w:szCs w:val="28"/>
-        </w:rPr>
-      </w:pPr>
-    </w:p>
-    <w:p>
-      <w:pPr>
         <w:pStyle w:val="Heading2"/>
       </w:pPr>
-      <w:r>
-        <w:t xml:space="preserve">Appendix A </w:t>
-      </w:r>
-      <w:r>
-        <w:t>–</w:t>
-      </w:r>
-      <w:r>
-        <w:t xml:space="preserve"> System Illustration</w:t>
-      </w:r>
     </w:p>
     <w:p>
       <w:pPr>
@@ -5372,7 +5011,6 @@
   <w:style w:type="character" w:default="1" w:styleId="DefaultParagraphFont">
     <w:name w:val="Default Paragraph Font"/>
     <w:uiPriority w:val="1"/>
-    <w:semiHidden/>
     <w:unhideWhenUsed/>
   </w:style>
   <w:style w:type="table" w:default="1" w:styleId="TableNormal">

</xml_diff>